<commit_message>
Feat: ajout statistiques jour, changement historique des transactions et complétion doc
</commit_message>
<xml_diff>
--- a/doc/R-I320-lucpardo-rapport.docx
+++ b/doc/R-I320-lucpardo-rapport.docx
@@ -137,7 +137,6 @@
         </w:rPr>
       </w:pPr>
       <w:proofErr w:type="spellStart"/>
-      <w:proofErr w:type="gramStart"/>
       <w:r>
         <w:rPr>
           <w:lang w:val="en-US"/>
@@ -145,7 +144,6 @@
         <w:t>A.Curchod</w:t>
       </w:r>
       <w:proofErr w:type="spellEnd"/>
-      <w:proofErr w:type="gramEnd"/>
     </w:p>
     <w:p>
       <w:pPr>
@@ -3432,15 +3430,7 @@
         <w:t>à</w:t>
       </w:r>
       <w:r>
-        <w:t xml:space="preserve"> programmer en </w:t>
-      </w:r>
-      <w:proofErr w:type="gramStart"/>
-      <w:r>
-        <w:t>orienté</w:t>
-      </w:r>
-      <w:proofErr w:type="gramEnd"/>
-      <w:r>
-        <w:t xml:space="preserve"> objet et pour ce projet il faudra programmer une interface de parking avec des entrées des sorties des transactions etc.</w:t>
+        <w:t xml:space="preserve"> programmer en orienté objet et pour ce projet il faudra programmer une interface de parking avec des entrées des sorties des transactions etc.</w:t>
       </w:r>
     </w:p>
     <w:p>
@@ -4110,12 +4100,10 @@
         <w:t xml:space="preserve">Indiquer l’heure d’entrée, sortie et la durée puis faire un montant </w:t>
       </w:r>
       <w:proofErr w:type="spellStart"/>
-      <w:proofErr w:type="gramStart"/>
       <w:r>
         <w:t>a</w:t>
       </w:r>
       <w:proofErr w:type="spellEnd"/>
-      <w:proofErr w:type="gramEnd"/>
       <w:r>
         <w:t xml:space="preserve"> payer par ex : 1.- par heure.</w:t>
       </w:r>
@@ -4678,15 +4666,7 @@
               <w:ind w:left="0"/>
             </w:pPr>
             <w:r>
-              <w:t xml:space="preserve">On va mettre le matricule de la voiture puis la chercher dans le tableau place pour afficher dans </w:t>
-            </w:r>
-            <w:proofErr w:type="gramStart"/>
-            <w:r>
-              <w:t>quel place</w:t>
-            </w:r>
-            <w:proofErr w:type="gramEnd"/>
-            <w:r>
-              <w:t xml:space="preserve"> elle est</w:t>
+              <w:t>On va mettre le matricule de la voiture puis la chercher dans le tableau place pour afficher dans quel place elle est</w:t>
             </w:r>
           </w:p>
         </w:tc>
@@ -4717,13 +4697,8 @@
               <w:pStyle w:val="Retraitcorpsdetexte3"/>
               <w:ind w:left="0"/>
             </w:pPr>
-            <w:proofErr w:type="gramStart"/>
             <w:r>
-              <w:t>va</w:t>
-            </w:r>
-            <w:proofErr w:type="gramEnd"/>
-            <w:r>
-              <w:t xml:space="preserve"> calculer les places occupées et libres dans le tableau place et afficher le % total, montant total, payé dans la journée et durée de stationnement de chaque véhicule présent.</w:t>
+              <w:t>va calculer les places occupées et libres dans le tableau place et afficher le % total, montant total, payé dans la journée et durée de stationnement de chaque véhicule présent.</w:t>
             </w:r>
           </w:p>
         </w:tc>
@@ -4879,676 +4854,568 @@
     <w:p>
       <w:pPr>
         <w:pStyle w:val="Informations"/>
-        <w:numPr>
-          <w:ilvl w:val="5"/>
-          <w:numId w:val="5"/>
-        </w:numPr>
-      </w:pPr>
-      <w:r>
-        <w:t>Ce</w:t>
-      </w:r>
-      <w:r>
-        <w:t>tte partie</w:t>
-      </w:r>
-      <w:r>
-        <w:t xml:space="preserve"> permet de reproduire ou reprendre le projet par un tiers.</w:t>
+        <w:ind w:left="0"/>
+        <w:rPr>
+          <w:color w:val="000000" w:themeColor="text1"/>
+          <w:sz w:val="20"/>
+        </w:rPr>
+      </w:pPr>
+      <w:r>
+        <w:rPr>
+          <w:color w:val="000000" w:themeColor="text1"/>
+          <w:sz w:val="20"/>
+        </w:rPr>
+        <w:t xml:space="preserve">J’ai passé la plupart de mon temps </w:t>
+      </w:r>
+      <w:proofErr w:type="spellStart"/>
+      <w:r>
+        <w:rPr>
+          <w:color w:val="000000" w:themeColor="text1"/>
+          <w:sz w:val="20"/>
+        </w:rPr>
+        <w:t>a</w:t>
+      </w:r>
+      <w:proofErr w:type="spellEnd"/>
+      <w:r>
+        <w:rPr>
+          <w:color w:val="000000" w:themeColor="text1"/>
+          <w:sz w:val="20"/>
+        </w:rPr>
+        <w:t xml:space="preserve"> comprendre et à appliquer ce que je comprenais et quand quelque chose me </w:t>
+      </w:r>
+      <w:r>
+        <w:rPr>
+          <w:color w:val="000000" w:themeColor="text1"/>
+          <w:sz w:val="20"/>
+        </w:rPr>
+        <w:t>dérangeait</w:t>
+      </w:r>
+      <w:r>
+        <w:rPr>
+          <w:color w:val="000000" w:themeColor="text1"/>
+          <w:sz w:val="20"/>
+        </w:rPr>
+        <w:t xml:space="preserve"> comme le fait que le </w:t>
+      </w:r>
+      <w:proofErr w:type="spellStart"/>
+      <w:r>
+        <w:rPr>
+          <w:color w:val="000000" w:themeColor="text1"/>
+          <w:sz w:val="20"/>
+        </w:rPr>
+        <w:t>clear</w:t>
+      </w:r>
+      <w:proofErr w:type="spellEnd"/>
+      <w:r>
+        <w:rPr>
+          <w:color w:val="000000" w:themeColor="text1"/>
+          <w:sz w:val="20"/>
+        </w:rPr>
+        <w:t xml:space="preserve"> ne </w:t>
+      </w:r>
+      <w:proofErr w:type="spellStart"/>
+      <w:r>
+        <w:rPr>
+          <w:color w:val="000000" w:themeColor="text1"/>
+          <w:sz w:val="20"/>
+        </w:rPr>
+        <w:t>clear</w:t>
+      </w:r>
+      <w:proofErr w:type="spellEnd"/>
+      <w:r>
+        <w:rPr>
+          <w:color w:val="000000" w:themeColor="text1"/>
+          <w:sz w:val="20"/>
+        </w:rPr>
+        <w:t xml:space="preserve"> pas le </w:t>
+      </w:r>
+      <w:proofErr w:type="spellStart"/>
+      <w:r>
+        <w:rPr>
+          <w:color w:val="000000" w:themeColor="text1"/>
+          <w:sz w:val="20"/>
+        </w:rPr>
+        <w:t>scrollback</w:t>
+      </w:r>
+      <w:proofErr w:type="spellEnd"/>
+      <w:r>
+        <w:rPr>
+          <w:color w:val="000000" w:themeColor="text1"/>
+          <w:sz w:val="20"/>
+        </w:rPr>
+        <w:t xml:space="preserve"> j’ai dû demander </w:t>
+      </w:r>
+      <w:proofErr w:type="spellStart"/>
+      <w:r>
+        <w:rPr>
+          <w:color w:val="000000" w:themeColor="text1"/>
+          <w:sz w:val="20"/>
+        </w:rPr>
+        <w:t>a</w:t>
+      </w:r>
+      <w:proofErr w:type="spellEnd"/>
+      <w:r>
+        <w:rPr>
+          <w:color w:val="000000" w:themeColor="text1"/>
+          <w:sz w:val="20"/>
+        </w:rPr>
+        <w:t xml:space="preserve"> l’IA qu’est ce qui se passais d’où l’utilisation de « </w:t>
+      </w:r>
+      <w:proofErr w:type="spellStart"/>
+      <w:r>
+        <w:rPr>
+          <w:color w:val="000000" w:themeColor="text1"/>
+          <w:sz w:val="20"/>
+        </w:rPr>
+        <w:t>Console.Write</w:t>
+      </w:r>
+      <w:proofErr w:type="spellEnd"/>
+      <w:r>
+        <w:rPr>
+          <w:color w:val="000000" w:themeColor="text1"/>
+          <w:sz w:val="20"/>
+        </w:rPr>
+        <w:t>("\x1b[3J");</w:t>
+      </w:r>
+      <w:r>
+        <w:rPr>
+          <w:color w:val="000000" w:themeColor="text1"/>
+          <w:sz w:val="20"/>
+        </w:rPr>
+        <w:t> ».</w:t>
       </w:r>
     </w:p>
     <w:p>
       <w:pPr>
         <w:pStyle w:val="Informations"/>
-        <w:numPr>
-          <w:ilvl w:val="5"/>
-          <w:numId w:val="5"/>
-        </w:numPr>
-      </w:pPr>
-      <w:r>
-        <w:t xml:space="preserve">Pour chaque </w:t>
-      </w:r>
-      <w:r>
-        <w:t xml:space="preserve">étape, il faut décrire sa mise en </w:t>
-      </w:r>
-      <w:r>
-        <w:t>œuvre. Typiquement</w:t>
-      </w:r>
-      <w:r>
-        <w:t> :</w:t>
+        <w:ind w:left="0"/>
+        <w:rPr>
+          <w:color w:val="000000" w:themeColor="text1"/>
+          <w:sz w:val="20"/>
+        </w:rPr>
+      </w:pPr>
+      <w:r>
+        <w:rPr>
+          <w:color w:val="000000" w:themeColor="text1"/>
+          <w:sz w:val="20"/>
+        </w:rPr>
+        <w:t>J’ai aussi passé pas mal de temps à discuter de comment chacun a fait quelle étape avec Alessio, Hugo et Raphaël.</w:t>
       </w:r>
     </w:p>
     <w:p>
       <w:pPr>
         <w:pStyle w:val="Informations"/>
-        <w:numPr>
-          <w:ilvl w:val="6"/>
-          <w:numId w:val="5"/>
-        </w:numPr>
-      </w:pPr>
-      <w:r>
-        <w:t>Versions des outils logiciels utilisés (OS, applications, pilotes, librairies, etc.)</w:t>
-      </w:r>
-    </w:p>
-    <w:p>
-      <w:pPr>
-        <w:pStyle w:val="Informations"/>
-        <w:numPr>
-          <w:ilvl w:val="6"/>
-          <w:numId w:val="5"/>
-        </w:numPr>
-      </w:pPr>
-      <w:r>
-        <w:t>Configurations spéciales</w:t>
-      </w:r>
-      <w:r>
-        <w:t xml:space="preserve"> des outils (Equipements, </w:t>
-      </w:r>
-      <w:r>
-        <w:t>PC</w:t>
-      </w:r>
-      <w:r>
-        <w:t xml:space="preserve">, machines, </w:t>
-      </w:r>
-      <w:r>
-        <w:t xml:space="preserve">outillage, </w:t>
-      </w:r>
-      <w:r>
-        <w:t>etc.)</w:t>
-      </w:r>
-    </w:p>
-    <w:p>
-      <w:pPr>
-        <w:pStyle w:val="Informations"/>
-        <w:numPr>
-          <w:ilvl w:val="6"/>
-          <w:numId w:val="5"/>
-        </w:numPr>
-      </w:pPr>
-      <w:r>
-        <w:t xml:space="preserve">Code source </w:t>
-      </w:r>
-      <w:r>
-        <w:t xml:space="preserve">commenté </w:t>
-      </w:r>
-      <w:r>
-        <w:t xml:space="preserve">des </w:t>
-      </w:r>
-      <w:r>
-        <w:t>éléments logiciels</w:t>
-      </w:r>
-      <w:r>
-        <w:t xml:space="preserve"> développés.</w:t>
-      </w:r>
-    </w:p>
-    <w:p>
-      <w:pPr>
-        <w:pStyle w:val="Informations"/>
-        <w:numPr>
-          <w:ilvl w:val="6"/>
-          <w:numId w:val="5"/>
-        </w:numPr>
-      </w:pPr>
-      <w:r>
-        <w:t>Modèle physique d’une base de données.</w:t>
-      </w:r>
-    </w:p>
-    <w:p>
-      <w:pPr>
-        <w:pStyle w:val="Informations"/>
-        <w:numPr>
-          <w:ilvl w:val="6"/>
-          <w:numId w:val="5"/>
-        </w:numPr>
-      </w:pPr>
-      <w:r>
-        <w:t>Arborescences des documents produits</w:t>
-      </w:r>
-      <w:r>
-        <w:t>.</w:t>
-      </w:r>
-    </w:p>
-    <w:p>
-      <w:pPr>
-        <w:pStyle w:val="Informations"/>
-        <w:numPr>
-          <w:ilvl w:val="5"/>
-          <w:numId w:val="5"/>
-        </w:numPr>
-      </w:pPr>
-      <w:r>
-        <w:t>Il faut décrire le parcours de réalisation e</w:t>
-      </w:r>
-      <w:r>
-        <w:t>t</w:t>
-      </w:r>
-      <w:r>
-        <w:t xml:space="preserve"> justifi</w:t>
-      </w:r>
-      <w:r>
-        <w:t>er</w:t>
-      </w:r>
-      <w:r>
-        <w:t xml:space="preserve"> les choix. </w:t>
-      </w:r>
-    </w:p>
-    <w:p>
-      <w:pPr>
-        <w:pStyle w:val="Informations"/>
-      </w:pPr>
-    </w:p>
-    <w:p>
-      <w:pPr>
-        <w:pStyle w:val="Informations"/>
-      </w:pPr>
-    </w:p>
-    <w:p>
-      <w:pPr>
-        <w:pStyle w:val="Titre2"/>
-      </w:pPr>
-      <w:bookmarkStart w:id="20" w:name="_Toc532179960"/>
-      <w:bookmarkStart w:id="21" w:name="_Toc165969644"/>
-      <w:bookmarkStart w:id="22" w:name="_Toc179022946"/>
-      <w:r>
-        <w:t>Modifications</w:t>
+        <w:ind w:left="0"/>
+        <w:rPr>
+          <w:color w:val="000000" w:themeColor="text1"/>
+          <w:sz w:val="20"/>
+        </w:rPr>
+      </w:pPr>
+      <w:r>
+        <w:rPr>
+          <w:color w:val="000000" w:themeColor="text1"/>
+          <w:sz w:val="20"/>
+        </w:rPr>
+        <w:t xml:space="preserve">J’ai eu pas mal de </w:t>
+      </w:r>
+      <w:r>
+        <w:rPr>
+          <w:color w:val="000000" w:themeColor="text1"/>
+          <w:sz w:val="20"/>
+        </w:rPr>
+        <w:t>changements comparés</w:t>
+      </w:r>
+      <w:r>
+        <w:rPr>
+          <w:color w:val="000000" w:themeColor="text1"/>
+          <w:sz w:val="20"/>
+        </w:rPr>
+        <w:t xml:space="preserve"> </w:t>
+      </w:r>
+      <w:proofErr w:type="spellStart"/>
+      <w:r>
+        <w:rPr>
+          <w:color w:val="000000" w:themeColor="text1"/>
+          <w:sz w:val="20"/>
+        </w:rPr>
+        <w:t>a</w:t>
+      </w:r>
+      <w:proofErr w:type="spellEnd"/>
+      <w:r>
+        <w:rPr>
+          <w:color w:val="000000" w:themeColor="text1"/>
+          <w:sz w:val="20"/>
+        </w:rPr>
+        <w:t xml:space="preserve"> mon analyse principale et détaillé après nos discussions et vos interventions qui m’ont fait me remettre en question et ça m’a permis d’aller plus loin plus rapidement que je ne le pensais.</w:t>
+      </w:r>
+    </w:p>
+    <w:p>
+      <w:pPr>
+        <w:pStyle w:val="Titre1"/>
+      </w:pPr>
+      <w:bookmarkStart w:id="20" w:name="_Toc165969653"/>
+      <w:bookmarkStart w:id="21" w:name="_Toc179022949"/>
+      <w:r>
+        <w:t>Conclusion</w:t>
       </w:r>
       <w:bookmarkEnd w:id="20"/>
       <w:bookmarkEnd w:id="21"/>
+    </w:p>
+    <w:p>
+      <w:pPr>
+        <w:pStyle w:val="Titre2"/>
+      </w:pPr>
+      <w:bookmarkStart w:id="22" w:name="_Toc165969654"/>
+      <w:bookmarkStart w:id="23" w:name="_Toc179022950"/>
+      <w:r>
+        <w:t xml:space="preserve">Bilan des </w:t>
+      </w:r>
       <w:bookmarkEnd w:id="22"/>
-    </w:p>
-    <w:p>
-      <w:pPr>
-        <w:pStyle w:val="Informations"/>
-        <w:numPr>
-          <w:ilvl w:val="5"/>
-          <w:numId w:val="6"/>
-        </w:numPr>
-      </w:pPr>
-      <w:r>
-        <w:t>Historique</w:t>
-      </w:r>
-      <w:r>
-        <w:t xml:space="preserve"> des modifications demandées (ou nécessaires) au</w:t>
-      </w:r>
-      <w:r>
-        <w:t>x</w:t>
-      </w:r>
-      <w:r>
-        <w:t xml:space="preserve"> spécifications détaillé</w:t>
-      </w:r>
-      <w:r>
-        <w:t>es.</w:t>
-      </w:r>
-    </w:p>
-    <w:p>
-      <w:pPr>
-        <w:pStyle w:val="Informations"/>
-        <w:numPr>
-          <w:ilvl w:val="5"/>
-          <w:numId w:val="6"/>
-        </w:numPr>
-      </w:pPr>
-      <w:r>
-        <w:t>Date, raison, description, etc.</w:t>
+      <w:r>
+        <w:t>fonctionnalités demandées</w:t>
+      </w:r>
+      <w:bookmarkEnd w:id="23"/>
+    </w:p>
+    <w:p>
+      <w:pPr>
+        <w:pStyle w:val="Retraitcorpsdetexte"/>
+      </w:pPr>
+      <w:r>
+        <w:t>L’entrée de la voiture est totalement fonctionnelle car on peut entrer 2 lettres même si : en minuscule ou avec un espace avant ou un chiffre une lettre ce qui étaient des problèmes avant.</w:t>
+      </w:r>
+    </w:p>
+    <w:p>
+      <w:pPr>
+        <w:pStyle w:val="Retraitcorpsdetexte"/>
+      </w:pPr>
+      <w:r>
+        <w:t>De plus l’entrée des places vérifie que la place ne soit pas déjà occupée et il y a la liste des places libres qui s’affiche et le ticket avec l’heure d’arrivée la plaque et la place de la voiture.</w:t>
+      </w:r>
+    </w:p>
+    <w:p>
+      <w:pPr>
+        <w:pStyle w:val="Retraitcorpsdetexte"/>
+      </w:pPr>
+      <w:r>
+        <w:t xml:space="preserve">La sortie de la voiture est elle aussi faite correctement comme je le voulais on entre soit la plaque soit le numéro de place et </w:t>
+      </w:r>
+      <w:r>
+        <w:t>ç</w:t>
+      </w:r>
+      <w:r>
+        <w:t xml:space="preserve">a nous demande si c’est la bonne voiture et si on est </w:t>
+      </w:r>
+      <w:r>
+        <w:t>sûr</w:t>
+      </w:r>
+      <w:r>
+        <w:t xml:space="preserve"> de vouloir la sortir et </w:t>
+      </w:r>
+      <w:r>
+        <w:t>ça</w:t>
+      </w:r>
+      <w:r>
+        <w:t xml:space="preserve"> nous affiche le ticket avec en plus de ce qu’il y a été mis avant, le prix l’heure de sortie et la durée avec son tarif.</w:t>
+      </w:r>
+    </w:p>
+    <w:p>
+      <w:pPr>
+        <w:pStyle w:val="Retraitcorpsdetexte"/>
+      </w:pPr>
+    </w:p>
+    <w:p>
+      <w:pPr>
+        <w:pStyle w:val="Retraitcorpsdetexte"/>
+      </w:pPr>
+      <w:r>
+        <w:t>Afficher l’état du parking : Le parking s’affiche avec les places : o si libre et x si occupé</w:t>
+      </w:r>
+    </w:p>
+    <w:p>
+      <w:pPr>
+        <w:pStyle w:val="Retraitcorpsdetexte"/>
+      </w:pPr>
+    </w:p>
+    <w:p>
+      <w:pPr>
+        <w:pStyle w:val="Retraitcorpsdetexte"/>
+      </w:pPr>
+      <w:r>
+        <w:t xml:space="preserve">La recherche d’une voiture fonctionne tout aussi bien, elle fait la même chose que la recherche de la sortie voiture sans demander </w:t>
+      </w:r>
+      <w:r>
+        <w:t>à</w:t>
+      </w:r>
+      <w:r>
+        <w:t xml:space="preserve"> sortir.</w:t>
+      </w:r>
+    </w:p>
+    <w:p>
+      <w:pPr>
+        <w:pStyle w:val="Retraitcorpsdetexte"/>
+      </w:pPr>
+    </w:p>
+    <w:p>
+      <w:pPr>
+        <w:pStyle w:val="Retraitcorpsdetexte"/>
+      </w:pPr>
+      <w:r>
+        <w:t>Statistiques du jour aussi fonctionne, elle nous renvoie les places totales, les libres/occupés, taux d’occupation, somme de prix des transactions et la durée de stationnement des voitures.</w:t>
+      </w:r>
+    </w:p>
+    <w:p>
+      <w:pPr>
+        <w:pStyle w:val="Retraitcorpsdetexte"/>
+      </w:pPr>
+    </w:p>
+    <w:p>
+      <w:pPr>
+        <w:pStyle w:val="Retraitcorpsdetexte"/>
+      </w:pPr>
+      <w:r>
+        <w:t>L’historique des transactions affiche bel et bien la plaque la place et l’heure d’arrivée et sortie de la voiture ainsi que le prix payé.</w:t>
+      </w:r>
+    </w:p>
+    <w:p>
+      <w:pPr>
+        <w:pStyle w:val="Retraitcorpsdetexte"/>
+      </w:pPr>
+    </w:p>
+    <w:p>
+      <w:pPr>
+        <w:pStyle w:val="Retraitcorpsdetexte"/>
+      </w:pPr>
+    </w:p>
+    <w:p>
+      <w:pPr>
+        <w:pStyle w:val="Titre2"/>
+      </w:pPr>
+      <w:bookmarkStart w:id="24" w:name="_Toc165969655"/>
+      <w:bookmarkStart w:id="25" w:name="_Toc179022951"/>
+      <w:r>
+        <w:t>Bilan de la planification</w:t>
+      </w:r>
+      <w:bookmarkEnd w:id="24"/>
+      <w:bookmarkEnd w:id="25"/>
+    </w:p>
+    <w:p>
+      <w:pPr>
+        <w:pStyle w:val="Retraitcorpsdetexte"/>
+      </w:pPr>
+      <w:r>
+        <w:t>Je ne trouve pas avoir eu autant de retard ni d’avance dans ce projet malgré le fait que j’ai eu quelques problèmes avec mon analyse et le rendu final qui sont énormément différent sur certains points et qui on du me faire me remettre en question.</w:t>
+      </w:r>
+    </w:p>
+    <w:p>
+      <w:pPr>
+        <w:pStyle w:val="Titre2"/>
+      </w:pPr>
+      <w:bookmarkStart w:id="26" w:name="_Toc165969656"/>
+      <w:bookmarkStart w:id="27" w:name="_Toc179022952"/>
+      <w:r>
+        <w:t>Bilan personnel</w:t>
+      </w:r>
+      <w:bookmarkEnd w:id="26"/>
+      <w:bookmarkEnd w:id="27"/>
+    </w:p>
+    <w:p>
+      <w:pPr>
+        <w:pStyle w:val="Retraitcorpsdetexte"/>
+      </w:pPr>
+      <w:r>
+        <w:t>Si je devais refaire ce projet je garderais surement les petits briefs avec des questions pour remettre en question la personne car ça m’a énormément aidé</w:t>
       </w:r>
     </w:p>
     <w:p>
       <w:pPr>
         <w:pStyle w:val="Titre1"/>
       </w:pPr>
-      <w:bookmarkStart w:id="23" w:name="_Toc165969653"/>
-      <w:bookmarkStart w:id="24" w:name="_Toc179022949"/>
-      <w:r>
-        <w:t>Conclusion</w:t>
-      </w:r>
-      <w:bookmarkEnd w:id="23"/>
-      <w:bookmarkEnd w:id="24"/>
-    </w:p>
-    <w:p>
-      <w:pPr>
-        <w:pStyle w:val="Titre2"/>
-      </w:pPr>
-      <w:bookmarkStart w:id="25" w:name="_Toc165969654"/>
-      <w:bookmarkStart w:id="26" w:name="_Toc179022950"/>
-      <w:r>
-        <w:t xml:space="preserve">Bilan des </w:t>
-      </w:r>
-      <w:bookmarkEnd w:id="25"/>
-      <w:r>
-        <w:t>fonctionnalités demandées</w:t>
-      </w:r>
-      <w:bookmarkEnd w:id="26"/>
-    </w:p>
-    <w:p>
-      <w:pPr>
-        <w:pStyle w:val="Informations"/>
-        <w:numPr>
-          <w:ilvl w:val="5"/>
-          <w:numId w:val="7"/>
-        </w:numPr>
-      </w:pPr>
-      <w:r>
-        <w:t xml:space="preserve">Il s’agit de reprendre point par point les fonctionnalités décrites dans les spécifications de départ </w:t>
-      </w:r>
-      <w:r>
-        <w:t>et de définir si elles sont atteintes ou pas, et pourquoi.</w:t>
-      </w:r>
-    </w:p>
-    <w:p>
-      <w:pPr>
-        <w:pStyle w:val="Informations"/>
-        <w:numPr>
-          <w:ilvl w:val="5"/>
-          <w:numId w:val="7"/>
-        </w:numPr>
-      </w:pPr>
-      <w:r>
-        <w:t>Si ce n’est pas le cas, estimer</w:t>
-      </w:r>
-      <w:r>
-        <w:t xml:space="preserve"> en « % » ou en « temps supplémentaire » </w:t>
-      </w:r>
-      <w:r>
-        <w:t>le travail qu’il reste à accomplir pour terminer le tout.</w:t>
-      </w:r>
-    </w:p>
-    <w:p>
-      <w:pPr>
-        <w:pStyle w:val="Titre2"/>
-      </w:pPr>
-      <w:bookmarkStart w:id="27" w:name="_Toc165969655"/>
-      <w:bookmarkStart w:id="28" w:name="_Toc179022951"/>
-      <w:r>
-        <w:t>Bilan de la planification</w:t>
-      </w:r>
-      <w:bookmarkEnd w:id="27"/>
+      <w:bookmarkStart w:id="28" w:name="_Toc532179971"/>
+      <w:bookmarkStart w:id="29" w:name="_Toc165969657"/>
+      <w:bookmarkStart w:id="30" w:name="_Toc179022953"/>
+      <w:r>
+        <w:t>Divers</w:t>
+      </w:r>
       <w:bookmarkEnd w:id="28"/>
-    </w:p>
-    <w:p>
-      <w:pPr>
-        <w:pStyle w:val="Informations"/>
-        <w:numPr>
-          <w:ilvl w:val="5"/>
-          <w:numId w:val="8"/>
-        </w:numPr>
-      </w:pPr>
-      <w:r>
-        <w:t xml:space="preserve">Distinguer </w:t>
-      </w:r>
-      <w:r>
-        <w:t xml:space="preserve">et expliquer </w:t>
-      </w:r>
-      <w:r>
-        <w:t xml:space="preserve">les tâches qui ont généré des retards ou de l'avance dans la </w:t>
-      </w:r>
-      <w:r>
-        <w:t>gestion du</w:t>
-      </w:r>
-      <w:r>
-        <w:t xml:space="preserve"> projet.</w:t>
-      </w:r>
-      <w:r>
-        <w:t xml:space="preserve"> Indiquer </w:t>
-      </w:r>
-      <w:proofErr w:type="gramStart"/>
-      <w:r>
-        <w:t>les différence</w:t>
-      </w:r>
-      <w:proofErr w:type="gramEnd"/>
-      <w:r>
-        <w:t xml:space="preserve"> entre les planifications initiales et détaillées avec le journal de travail.</w:t>
-      </w:r>
-    </w:p>
-    <w:p>
-      <w:pPr>
-        <w:pStyle w:val="Titre2"/>
-      </w:pPr>
-      <w:bookmarkStart w:id="29" w:name="_Toc165969656"/>
-      <w:bookmarkStart w:id="30" w:name="_Toc179022952"/>
-      <w:r>
-        <w:lastRenderedPageBreak/>
-        <w:t>Bilan personnel</w:t>
-      </w:r>
       <w:bookmarkEnd w:id="29"/>
       <w:bookmarkEnd w:id="30"/>
     </w:p>
     <w:p>
       <w:pPr>
-        <w:pStyle w:val="Informations"/>
-        <w:numPr>
-          <w:ilvl w:val="5"/>
-          <w:numId w:val="8"/>
-        </w:numPr>
-      </w:pPr>
-      <w:r>
-        <w:t xml:space="preserve">Si c’était à </w:t>
-      </w:r>
-      <w:proofErr w:type="gramStart"/>
-      <w:r>
-        <w:t>refaire</w:t>
-      </w:r>
-      <w:r>
-        <w:t>:</w:t>
-      </w:r>
-      <w:proofErr w:type="gramEnd"/>
-    </w:p>
-    <w:p>
-      <w:pPr>
-        <w:pStyle w:val="Informations"/>
-        <w:numPr>
-          <w:ilvl w:val="6"/>
-          <w:numId w:val="8"/>
-        </w:numPr>
-      </w:pPr>
-      <w:r>
-        <w:t>Q</w:t>
-      </w:r>
-      <w:r>
-        <w:t xml:space="preserve">u’est-ce </w:t>
-      </w:r>
-      <w:r>
-        <w:t>qu’il faudrait garder</w:t>
-      </w:r>
-      <w:r>
-        <w:t> </w:t>
-      </w:r>
-      <w:r>
-        <w:t>? Les</w:t>
-      </w:r>
-      <w:r>
-        <w:t xml:space="preserve"> plus et les moins ?</w:t>
-      </w:r>
-    </w:p>
-    <w:p>
-      <w:pPr>
-        <w:pStyle w:val="Informations"/>
-        <w:numPr>
-          <w:ilvl w:val="6"/>
-          <w:numId w:val="8"/>
-        </w:numPr>
-      </w:pPr>
-      <w:r>
-        <w:t>Q</w:t>
-      </w:r>
-      <w:r>
-        <w:t xml:space="preserve">u’est-ce </w:t>
-      </w:r>
-      <w:r>
-        <w:t>qu’il faudrait gérer, réaliser ou traiter différemment ?</w:t>
-      </w:r>
-    </w:p>
-    <w:p>
-      <w:pPr>
-        <w:pStyle w:val="Informations"/>
-        <w:numPr>
-          <w:ilvl w:val="5"/>
-          <w:numId w:val="8"/>
-        </w:numPr>
-      </w:pPr>
-      <w:r>
-        <w:t>Qu’est que ce projet m’a appris ?</w:t>
-      </w:r>
-    </w:p>
-    <w:p>
-      <w:pPr>
-        <w:pStyle w:val="Informations"/>
-        <w:numPr>
-          <w:ilvl w:val="5"/>
-          <w:numId w:val="8"/>
-        </w:numPr>
-      </w:pPr>
-      <w:proofErr w:type="gramStart"/>
-      <w:r>
-        <w:t>Suite à</w:t>
-      </w:r>
-      <w:proofErr w:type="gramEnd"/>
-      <w:r>
-        <w:t xml:space="preserve"> donner, améliorations souhaitables, …</w:t>
-      </w:r>
-    </w:p>
-    <w:p>
-      <w:pPr>
-        <w:pStyle w:val="Informations"/>
-        <w:numPr>
-          <w:ilvl w:val="5"/>
-          <w:numId w:val="8"/>
-        </w:numPr>
-      </w:pPr>
-      <w:r>
-        <w:t>Remerciements, signature, etc.</w:t>
-      </w:r>
-    </w:p>
-    <w:p>
-      <w:pPr>
-        <w:pStyle w:val="Titre1"/>
-      </w:pPr>
-      <w:bookmarkStart w:id="31" w:name="_Toc532179971"/>
-      <w:bookmarkStart w:id="32" w:name="_Toc165969657"/>
-      <w:bookmarkStart w:id="33" w:name="_Toc179022953"/>
-      <w:r>
-        <w:t>Divers</w:t>
+        <w:pStyle w:val="Titre2"/>
+      </w:pPr>
+      <w:bookmarkStart w:id="31" w:name="_Toc179022955"/>
+      <w:r>
+        <w:t>Bibliographie</w:t>
       </w:r>
       <w:bookmarkEnd w:id="31"/>
-      <w:bookmarkEnd w:id="32"/>
-      <w:bookmarkEnd w:id="33"/>
-    </w:p>
-    <w:p>
-      <w:pPr>
-        <w:pStyle w:val="Titre2"/>
-      </w:pPr>
-      <w:bookmarkStart w:id="34" w:name="_Toc532179972"/>
-      <w:bookmarkStart w:id="35" w:name="_Toc165969658"/>
-      <w:bookmarkStart w:id="36" w:name="_Toc179022954"/>
-      <w:r>
-        <w:t>Journal de travail</w:t>
-      </w:r>
-      <w:bookmarkEnd w:id="34"/>
-      <w:bookmarkEnd w:id="35"/>
-      <w:bookmarkEnd w:id="36"/>
-    </w:p>
-    <w:p>
-      <w:pPr>
-        <w:pStyle w:val="Informations"/>
-        <w:numPr>
-          <w:ilvl w:val="5"/>
-          <w:numId w:val="9"/>
-        </w:numPr>
-      </w:pPr>
-      <w:r>
-        <w:t>Date, activité</w:t>
-      </w:r>
-      <w:r>
-        <w:t xml:space="preserve"> (description qui permet</w:t>
-      </w:r>
-      <w:r>
-        <w:t xml:space="preserve"> de reproduire le cheminement du projet)</w:t>
-      </w:r>
-      <w:r>
-        <w:t>, durée</w:t>
-      </w:r>
-      <w:r>
-        <w:t>, liens et références sur des documents externes</w:t>
-      </w:r>
-      <w:r>
-        <w:t>.</w:t>
-      </w:r>
-      <w:r>
-        <w:t xml:space="preserve"> Lorsqu’une activité de recherches a été entreprise, il convient d’énumérer ce qui a été trouvé, avec les références.</w:t>
-      </w:r>
-    </w:p>
-    <w:p>
-      <w:pPr>
-        <w:pStyle w:val="Informations"/>
-        <w:numPr>
-          <w:ilvl w:val="5"/>
-          <w:numId w:val="9"/>
-        </w:numPr>
-      </w:pPr>
-      <w:r>
-        <w:t xml:space="preserve">Votre journal de travail est basé sur </w:t>
-      </w:r>
+    </w:p>
+    <w:p>
+      <w:pPr>
+        <w:pStyle w:val="Retraitcorpsdetexte"/>
+      </w:pPr>
+      <w:r>
+        <w:t xml:space="preserve">IA : Claude, Je lui ai demandé : </w:t>
+      </w:r>
+    </w:p>
+    <w:p>
+      <w:pPr>
+        <w:pStyle w:val="Retraitcorpsdetexte"/>
+      </w:pPr>
+      <w:r>
+        <w:t xml:space="preserve">« Pourquoi en </w:t>
+      </w:r>
+      <w:proofErr w:type="spellStart"/>
+      <w:r>
+        <w:t>c#</w:t>
+      </w:r>
+      <w:proofErr w:type="spellEnd"/>
+      <w:r>
+        <w:t xml:space="preserve"> quand je mets en </w:t>
+      </w:r>
+      <w:proofErr w:type="spellStart"/>
+      <w:r>
+        <w:t>fullscreen</w:t>
+      </w:r>
+      <w:proofErr w:type="spellEnd"/>
+      <w:r>
+        <w:t xml:space="preserve"> le </w:t>
+      </w:r>
+      <w:proofErr w:type="spellStart"/>
+      <w:r>
+        <w:t>clear,clear</w:t>
+      </w:r>
+      <w:proofErr w:type="spellEnd"/>
+      <w:r>
+        <w:t xml:space="preserve"> tout, mais en minimisé ça ne </w:t>
+      </w:r>
+      <w:proofErr w:type="spellStart"/>
+      <w:r>
+        <w:t>clear</w:t>
+      </w:r>
+      <w:proofErr w:type="spellEnd"/>
+      <w:r>
+        <w:t xml:space="preserve"> que ce que je vois. »</w:t>
+      </w:r>
+    </w:p>
+    <w:p>
+      <w:pPr>
+        <w:pStyle w:val="Retraitcorpsdetexte"/>
+      </w:pPr>
+      <w:r>
+        <w:t xml:space="preserve"> et il m’a répondu que il s’agissais du </w:t>
+      </w:r>
+      <w:proofErr w:type="spellStart"/>
+      <w:r>
+        <w:t>scrollback</w:t>
+      </w:r>
+      <w:proofErr w:type="spellEnd"/>
+      <w:r>
+        <w:t xml:space="preserve"> et que ça gardais en mémoire et pour le supprimer il fallait mettre « </w:t>
+      </w:r>
+      <w:proofErr w:type="spellStart"/>
+      <w:r>
+        <w:t>Console.Write</w:t>
+      </w:r>
+      <w:proofErr w:type="spellEnd"/>
+      <w:r>
+        <w:t>("\x1b[3J");</w:t>
+      </w:r>
+      <w:r>
+        <w:t xml:space="preserve"> » </w:t>
+      </w:r>
+    </w:p>
+    <w:p>
+      <w:pPr>
+        <w:pStyle w:val="Retraitcorpsdetexte"/>
+      </w:pPr>
+      <w:r>
+        <w:t xml:space="preserve">et je lui ai demandé ce que </w:t>
+      </w:r>
+      <w:proofErr w:type="spellStart"/>
+      <w:r>
+        <w:t>ca</w:t>
+      </w:r>
+      <w:proofErr w:type="spellEnd"/>
+      <w:r>
+        <w:t xml:space="preserve"> fessais et il m’a dit</w:t>
+      </w:r>
+    </w:p>
+    <w:p>
+      <w:pPr>
+        <w:pStyle w:val="Retraitcorpsdetexte"/>
+      </w:pPr>
+      <w:r>
+        <w:t xml:space="preserve"> «</w:t>
+      </w:r>
+      <w:r>
+        <w:t xml:space="preserve"> La</w:t>
+      </w:r>
+      <w:r>
+        <w:t xml:space="preserve"> commande </w:t>
+      </w:r>
+      <w:proofErr w:type="spellStart"/>
+      <w:r>
+        <w:t>Console.Write</w:t>
+      </w:r>
+      <w:proofErr w:type="spellEnd"/>
+      <w:r>
+        <w:t xml:space="preserve">("\x1b[3J"); permet d'effacer le tampon d'affichage défilant (le </w:t>
+      </w:r>
+      <w:proofErr w:type="spellStart"/>
       <w:r>
         <w:rPr>
           <w:i/>
           <w:iCs/>
         </w:rPr>
-        <w:t>« T-Psys-part3-NomPrenom-jdt.txt »</w:t>
+        <w:t>scrollback</w:t>
+      </w:r>
+      <w:proofErr w:type="spellEnd"/>
+      <w:r>
+        <w:rPr>
+          <w:i/>
+          <w:iCs/>
+        </w:rPr>
+        <w:t xml:space="preserve"> buffer</w:t>
+      </w:r>
+      <w:r>
+        <w:t>) de la console</w:t>
+      </w:r>
+      <w:r>
+        <w:t> » </w:t>
       </w:r>
     </w:p>
     <w:p>
       <w:pPr>
         <w:pStyle w:val="Titre2"/>
       </w:pPr>
-      <w:bookmarkStart w:id="37" w:name="_Toc179022955"/>
-      <w:r>
-        <w:t>Bibliographie</w:t>
-      </w:r>
-      <w:bookmarkEnd w:id="37"/>
+      <w:bookmarkStart w:id="32" w:name="_Toc179022956"/>
+      <w:r>
+        <w:t>Webographie</w:t>
+      </w:r>
+      <w:bookmarkEnd w:id="32"/>
+    </w:p>
+    <w:p>
+      <w:pPr>
+        <w:pStyle w:val="Retraitcorpsdetexte"/>
+      </w:pPr>
+      <w:r>
+        <w:t>Enseignement-section-</w:t>
+      </w:r>
+      <w:proofErr w:type="spellStart"/>
+      <w:r>
+        <w:t>inf</w:t>
+      </w:r>
+      <w:proofErr w:type="spellEnd"/>
+      <w:r>
+        <w:t xml:space="preserve"> pour avoir la théorie a coté quand j’en avais besoin</w:t>
+      </w:r>
     </w:p>
     <w:p>
       <w:pPr>
         <w:pStyle w:val="Informations"/>
-        <w:numPr>
-          <w:ilvl w:val="5"/>
-          <w:numId w:val="9"/>
-        </w:numPr>
-      </w:pPr>
-      <w:r>
-        <w:t>Références des livres</w:t>
-      </w:r>
-      <w:r>
-        <w:t>, revues et publications</w:t>
-      </w:r>
-      <w:r>
-        <w:t xml:space="preserve"> u</w:t>
-      </w:r>
-      <w:r>
-        <w:t>tilisés durant le projet.</w:t>
-      </w:r>
-    </w:p>
-    <w:p>
-      <w:pPr>
-        <w:pStyle w:val="Titre2"/>
-      </w:pPr>
-      <w:bookmarkStart w:id="38" w:name="_Toc179022956"/>
-      <w:r>
-        <w:t>Webographie</w:t>
-      </w:r>
-      <w:bookmarkEnd w:id="38"/>
-    </w:p>
-    <w:p>
-      <w:pPr>
-        <w:pStyle w:val="Informations"/>
-        <w:numPr>
-          <w:ilvl w:val="5"/>
-          <w:numId w:val="9"/>
-        </w:numPr>
-      </w:pPr>
-      <w:r>
-        <w:t>Références des sites Internet consultés durant le projet.</w:t>
-      </w:r>
-    </w:p>
-    <w:p>
-      <w:pPr>
-        <w:pStyle w:val="Titre1"/>
-      </w:pPr>
-      <w:bookmarkStart w:id="39" w:name="_Toc179022957"/>
-      <w:r>
-        <w:t>Annexes</w:t>
-      </w:r>
-      <w:bookmarkEnd w:id="39"/>
-    </w:p>
-    <w:p>
-      <w:pPr>
-        <w:pStyle w:val="Informations"/>
-        <w:numPr>
-          <w:ilvl w:val="5"/>
-          <w:numId w:val="9"/>
-        </w:numPr>
-      </w:pPr>
-      <w:proofErr w:type="gramStart"/>
-      <w:r>
-        <w:t>Listing</w:t>
-      </w:r>
-      <w:proofErr w:type="gramEnd"/>
-      <w:r>
-        <w:t xml:space="preserve"> du code source (partiel ou, plus rarement complet</w:t>
-      </w:r>
-      <w:r>
-        <w:t>. =&gt; Complet pour les scripts</w:t>
-      </w:r>
-      <w:r>
-        <w:t>)</w:t>
-      </w:r>
-    </w:p>
-    <w:p>
-      <w:pPr>
-        <w:pStyle w:val="Informations"/>
-        <w:numPr>
-          <w:ilvl w:val="5"/>
-          <w:numId w:val="9"/>
-        </w:numPr>
-        <w:rPr>
-          <w:strike/>
-        </w:rPr>
-      </w:pPr>
-      <w:r>
-        <w:rPr>
-          <w:strike/>
-        </w:rPr>
-        <w:t>Guide</w:t>
-      </w:r>
-      <w:r>
-        <w:rPr>
-          <w:strike/>
-        </w:rPr>
-        <w:t>(s)</w:t>
-      </w:r>
-      <w:r>
-        <w:rPr>
-          <w:strike/>
-        </w:rPr>
-        <w:t xml:space="preserve"> d’utilisation et/ou guide de l’administrateur</w:t>
-      </w:r>
-    </w:p>
-    <w:p>
-      <w:pPr>
-        <w:pStyle w:val="Informations"/>
-        <w:numPr>
-          <w:ilvl w:val="5"/>
-          <w:numId w:val="9"/>
-        </w:numPr>
-      </w:pPr>
-      <w:r>
-        <w:t>Etat ou</w:t>
-      </w:r>
-      <w:r>
-        <w:t xml:space="preserve"> « dump » </w:t>
-      </w:r>
-      <w:r>
-        <w:t xml:space="preserve">de la configuration </w:t>
-      </w:r>
-      <w:r>
-        <w:t>des équipements</w:t>
-      </w:r>
-      <w:r>
-        <w:t xml:space="preserve"> (routeur, switch, robot, etc.).</w:t>
-      </w:r>
-    </w:p>
-    <w:p>
-      <w:pPr>
-        <w:pStyle w:val="Informations"/>
-        <w:numPr>
-          <w:ilvl w:val="5"/>
-          <w:numId w:val="9"/>
-        </w:numPr>
-      </w:pPr>
-      <w:r>
-        <w:t>Extraits</w:t>
-      </w:r>
-      <w:r>
-        <w:t xml:space="preserve"> de catalogue, documentation de fabricant</w:t>
-      </w:r>
-      <w:r>
-        <w:t>, etc.</w:t>
-      </w:r>
+        <w:ind w:left="2160"/>
+      </w:pPr>
     </w:p>
     <w:sectPr>
       <w:headerReference w:type="default" r:id="rId12"/>
@@ -6049,7 +5916,7 @@
               <w:noProof/>
               <w:szCs w:val="16"/>
             </w:rPr>
-            <w:t>28.08.2026 11:22</w:t>
+            <w:t>04.09.2026 11:17</w:t>
           </w:r>
           <w:r>
             <w:rPr>
@@ -6136,9 +6003,9 @@
       <w:tblLook w:val="01E0" w:firstRow="1" w:lastRow="1" w:firstColumn="1" w:lastColumn="1" w:noHBand="0" w:noVBand="0"/>
     </w:tblPr>
     <w:tblGrid>
-      <w:gridCol w:w="2402"/>
-      <w:gridCol w:w="4400"/>
-      <w:gridCol w:w="2268"/>
+      <w:gridCol w:w="2390"/>
+      <w:gridCol w:w="4411"/>
+      <w:gridCol w:w="2269"/>
     </w:tblGrid>
     <w:tr>
       <w:trPr>
@@ -6261,7 +6128,7 @@
         <v:path o:extrusionok="f" gradientshapeok="t" o:connecttype="rect"/>
         <o:lock v:ext="edit" aspectratio="t"/>
       </v:shapetype>
-      <v:shape id="_x0000_i1025" type="#_x0000_t75" style="width:14.5pt;height:14.5pt" o:bullet="t">
+      <v:shape id="_x0000_i1025" type="#_x0000_t75" style="width:14.4pt;height:14.4pt" o:bullet="t">
         <v:imagedata r:id="rId1" o:title="BD10263_"/>
       </v:shape>
     </w:pict>
@@ -8400,7 +8267,6 @@
   <w:style w:type="character" w:default="1" w:styleId="Policepardfaut">
     <w:name w:val="Default Paragraph Font"/>
     <w:uiPriority w:val="1"/>
-    <w:semiHidden/>
     <w:unhideWhenUsed/>
   </w:style>
   <w:style w:type="table" w:default="1" w:styleId="TableauNormal">
@@ -9219,6 +9085,30 @@
 </file>
 
 <file path=customXml/item1.xml><?xml version="1.0" encoding="utf-8"?>
+<p:properties xmlns:p="http://schemas.microsoft.com/office/2006/metadata/properties" xmlns:xsi="http://www.w3.org/2001/XMLSchema-instance" xmlns:pc="http://schemas.microsoft.com/office/infopath/2007/PartnerControls">
+  <documentManagement>
+    <lcf76f155ced4ddcb4097134ff3c332f xmlns="3eb094ff-ec8d-44d8-be06-94ad3ec8832a">
+      <Terms xmlns="http://schemas.microsoft.com/office/infopath/2007/PartnerControls"/>
+    </lcf76f155ced4ddcb4097134ff3c332f>
+    <TaxCatchAll xmlns="4356f79f-5386-4bda-9d92-82d8bd7b074e" xsi:nil="true"/>
+  </documentManagement>
+</p:properties>
+</file>
+
+<file path=customXml/item2.xml><?xml version="1.0" encoding="utf-8"?>
+<b:Sources xmlns:b="http://schemas.openxmlformats.org/officeDocument/2006/bibliography" xmlns="http://schemas.openxmlformats.org/officeDocument/2006/bibliography" SelectedStyle="\APA.XSL" StyleName="APA"/>
+</file>
+
+<file path=customXml/item3.xml><?xml version="1.0" encoding="utf-8"?>
+<?mso-contentType ?>
+<FormTemplates xmlns="http://schemas.microsoft.com/sharepoint/v3/contenttype/forms">
+  <Display>DocumentLibraryForm</Display>
+  <Edit>DocumentLibraryForm</Edit>
+  <New>DocumentLibraryForm</New>
+</FormTemplates>
+</file>
+
+<file path=customXml/item4.xml><?xml version="1.0" encoding="utf-8"?>
 <ct:contentTypeSchema xmlns:ct="http://schemas.microsoft.com/office/2006/metadata/contentType" xmlns:ma="http://schemas.microsoft.com/office/2006/metadata/properties/metaAttributes" ct:_="" ma:_="" ma:contentTypeName="Document" ma:contentTypeID="0x01010051C931FEC57CD24D841BB655C8BA0DFF" ma:contentTypeVersion="11" ma:contentTypeDescription="Crée un document." ma:contentTypeScope="" ma:versionID="4534f2c9495d21086e4fff287ef3f94a">
   <xsd:schema xmlns:xsd="http://www.w3.org/2001/XMLSchema" xmlns:xs="http://www.w3.org/2001/XMLSchema" xmlns:p="http://schemas.microsoft.com/office/2006/metadata/properties" xmlns:ns2="3eb094ff-ec8d-44d8-be06-94ad3ec8832a" xmlns:ns3="4356f79f-5386-4bda-9d92-82d8bd7b074e" targetNamespace="http://schemas.microsoft.com/office/2006/metadata/properties" ma:root="true" ma:fieldsID="67cd8cb0a5c07e15b894fcbe607990d6" ns2:_="" ns3:_="">
     <xsd:import namespace="3eb094ff-ec8d-44d8-be06-94ad3ec8832a"/>
@@ -9413,31 +9303,34 @@
 </ct:contentTypeSchema>
 </file>
 
-<file path=customXml/item2.xml><?xml version="1.0" encoding="utf-8"?>
-<?mso-contentType ?>
-<FormTemplates xmlns="http://schemas.microsoft.com/sharepoint/v3/contenttype/forms">
-  <Display>DocumentLibraryForm</Display>
-  <Edit>DocumentLibraryForm</Edit>
-  <New>DocumentLibraryForm</New>
-</FormTemplates>
+<file path=customXml/itemProps1.xml><?xml version="1.0" encoding="utf-8"?>
+<ds:datastoreItem xmlns:ds="http://schemas.openxmlformats.org/officeDocument/2006/customXml" ds:itemID="{B7C8FFAF-5E4F-48C3-8E23-6E376B8B0EF3}">
+  <ds:schemaRefs>
+    <ds:schemaRef ds:uri="http://schemas.microsoft.com/office/2006/metadata/properties"/>
+    <ds:schemaRef ds:uri="http://schemas.microsoft.com/office/infopath/2007/PartnerControls"/>
+    <ds:schemaRef ds:uri="3eb094ff-ec8d-44d8-be06-94ad3ec8832a"/>
+    <ds:schemaRef ds:uri="4356f79f-5386-4bda-9d92-82d8bd7b074e"/>
+  </ds:schemaRefs>
+</ds:datastoreItem>
 </file>
 
-<file path=customXml/item3.xml><?xml version="1.0" encoding="utf-8"?>
-<b:Sources xmlns:b="http://schemas.openxmlformats.org/officeDocument/2006/bibliography" xmlns="http://schemas.openxmlformats.org/officeDocument/2006/bibliography" SelectedStyle="\APA.XSL" StyleName="APA"/>
+<file path=customXml/itemProps2.xml><?xml version="1.0" encoding="utf-8"?>
+<ds:datastoreItem xmlns:ds="http://schemas.openxmlformats.org/officeDocument/2006/customXml" ds:itemID="{C8C35155-3E6A-4058-B6E4-303717845E3B}">
+  <ds:schemaRefs>
+    <ds:schemaRef ds:uri="http://schemas.openxmlformats.org/officeDocument/2006/bibliography"/>
+  </ds:schemaRefs>
+</ds:datastoreItem>
 </file>
 
-<file path=customXml/item4.xml><?xml version="1.0" encoding="utf-8"?>
-<p:properties xmlns:p="http://schemas.microsoft.com/office/2006/metadata/properties" xmlns:xsi="http://www.w3.org/2001/XMLSchema-instance" xmlns:pc="http://schemas.microsoft.com/office/infopath/2007/PartnerControls">
-  <documentManagement>
-    <lcf76f155ced4ddcb4097134ff3c332f xmlns="3eb094ff-ec8d-44d8-be06-94ad3ec8832a">
-      <Terms xmlns="http://schemas.microsoft.com/office/infopath/2007/PartnerControls"/>
-    </lcf76f155ced4ddcb4097134ff3c332f>
-    <TaxCatchAll xmlns="4356f79f-5386-4bda-9d92-82d8bd7b074e" xsi:nil="true"/>
-  </documentManagement>
-</p:properties>
+<file path=customXml/itemProps3.xml><?xml version="1.0" encoding="utf-8"?>
+<ds:datastoreItem xmlns:ds="http://schemas.openxmlformats.org/officeDocument/2006/customXml" ds:itemID="{D50B1B85-B38C-42B6-8D6D-CA5E5B768EB8}">
+  <ds:schemaRefs>
+    <ds:schemaRef ds:uri="http://schemas.microsoft.com/sharepoint/v3/contenttype/forms"/>
+  </ds:schemaRefs>
+</ds:datastoreItem>
 </file>
 
-<file path=customXml/itemProps1.xml><?xml version="1.0" encoding="utf-8"?>
+<file path=customXml/itemProps4.xml><?xml version="1.0" encoding="utf-8"?>
 <ds:datastoreItem xmlns:ds="http://schemas.openxmlformats.org/officeDocument/2006/customXml" ds:itemID="{2735B910-DAF2-4BA5-848F-79178F01F74C}">
   <ds:schemaRefs>
     <ds:schemaRef ds:uri="http://schemas.microsoft.com/office/2006/metadata/contentType"/>
@@ -9454,31 +9347,4 @@
     <ds:schemaRef ds:uri="http://schemas.microsoft.com/internal/obd"/>
   </ds:schemaRefs>
 </ds:datastoreItem>
-</file>
-
-<file path=customXml/itemProps2.xml><?xml version="1.0" encoding="utf-8"?>
-<ds:datastoreItem xmlns:ds="http://schemas.openxmlformats.org/officeDocument/2006/customXml" ds:itemID="{D50B1B85-B38C-42B6-8D6D-CA5E5B768EB8}">
-  <ds:schemaRefs>
-    <ds:schemaRef ds:uri="http://schemas.microsoft.com/sharepoint/v3/contenttype/forms"/>
-  </ds:schemaRefs>
-</ds:datastoreItem>
-</file>
-
-<file path=customXml/itemProps3.xml><?xml version="1.0" encoding="utf-8"?>
-<ds:datastoreItem xmlns:ds="http://schemas.openxmlformats.org/officeDocument/2006/customXml" ds:itemID="{C8C35155-3E6A-4058-B6E4-303717845E3B}">
-  <ds:schemaRefs>
-    <ds:schemaRef ds:uri="http://schemas.openxmlformats.org/officeDocument/2006/bibliography"/>
-  </ds:schemaRefs>
-</ds:datastoreItem>
-</file>
-
-<file path=customXml/itemProps4.xml><?xml version="1.0" encoding="utf-8"?>
-<ds:datastoreItem xmlns:ds="http://schemas.openxmlformats.org/officeDocument/2006/customXml" ds:itemID="{B7C8FFAF-5E4F-48C3-8E23-6E376B8B0EF3}">
-  <ds:schemaRefs>
-    <ds:schemaRef ds:uri="http://schemas.microsoft.com/office/2006/metadata/properties"/>
-    <ds:schemaRef ds:uri="http://schemas.microsoft.com/office/infopath/2007/PartnerControls"/>
-    <ds:schemaRef ds:uri="3eb094ff-ec8d-44d8-be06-94ad3ec8832a"/>
-    <ds:schemaRef ds:uri="4356f79f-5386-4bda-9d92-82d8bd7b074e"/>
-  </ds:schemaRefs>
-</ds:datastoreItem>
 </file>
</xml_diff>